<commit_message>
Diagrama de arquitectura modificado
</commit_message>
<xml_diff>
--- a/DOCS/User_stories.docx
+++ b/DOCS/User_stories.docx
@@ -211,7 +211,7 @@
           <w:szCs w:val="22"/>
           <w:lang w:eastAsia="es-ES_tradnl"/>
         </w:rPr>
-        <w:pict w14:anchorId="4FECCEF0">
+        <w:pict w14:anchorId="2C3624C5">
           <v:rect id="_x0000_i1068" alt="" style="width:425.2pt;height:.05pt;mso-width-percent:0;mso-height-percent:0;mso-width-percent:0;mso-height-percent:0" o:hralign="center" o:hrstd="t" o:hr="t" fillcolor="#a0a0a0" stroked="f"/>
         </w:pict>
       </w:r>
@@ -445,7 +445,7 @@
           <w:szCs w:val="22"/>
           <w:lang w:eastAsia="es-ES_tradnl"/>
         </w:rPr>
-        <w:pict w14:anchorId="6FAEDADA">
+        <w:pict w14:anchorId="0764C5E6">
           <v:rect id="_x0000_i1067" alt="" style="width:425.2pt;height:.05pt;mso-width-percent:0;mso-height-percent:0;mso-width-percent:0;mso-height-percent:0" o:hralign="center" o:hrstd="t" o:hr="t" fillcolor="#a0a0a0" stroked="f"/>
         </w:pict>
       </w:r>
@@ -688,7 +688,7 @@
           <w:szCs w:val="22"/>
           <w:lang w:eastAsia="es-ES_tradnl"/>
         </w:rPr>
-        <w:pict w14:anchorId="57301F16">
+        <w:pict w14:anchorId="16991736">
           <v:rect id="_x0000_i1066" alt="" style="width:425.2pt;height:.05pt;mso-width-percent:0;mso-height-percent:0;mso-width-percent:0;mso-height-percent:0" o:hralign="center" o:hrstd="t" o:hr="t" fillcolor="#a0a0a0" stroked="f"/>
         </w:pict>
       </w:r>
@@ -1128,7 +1128,7 @@
           <w:szCs w:val="22"/>
           <w:lang w:eastAsia="es-ES_tradnl"/>
         </w:rPr>
-        <w:pict w14:anchorId="16E03894">
+        <w:pict w14:anchorId="2A391860">
           <v:rect id="_x0000_i1065" alt="" style="width:425.2pt;height:.05pt;mso-width-percent:0;mso-height-percent:0;mso-width-percent:0;mso-height-percent:0" o:hralign="center" o:hrstd="t" o:hr="t" fillcolor="#a0a0a0" stroked="f"/>
         </w:pict>
       </w:r>
@@ -1355,7 +1355,7 @@
           <w:szCs w:val="22"/>
           <w:lang w:eastAsia="es-ES_tradnl"/>
         </w:rPr>
-        <w:pict w14:anchorId="500C88B5">
+        <w:pict w14:anchorId="029E51FB">
           <v:rect id="_x0000_i1064" alt="" style="width:425.2pt;height:.05pt;mso-width-percent:0;mso-height-percent:0;mso-width-percent:0;mso-height-percent:0" o:hralign="center" o:hrstd="t" o:hr="t" fillcolor="#a0a0a0" stroked="f"/>
         </w:pict>
       </w:r>
@@ -1570,7 +1570,7 @@
           <w:szCs w:val="22"/>
           <w:lang w:eastAsia="es-ES_tradnl"/>
         </w:rPr>
-        <w:pict w14:anchorId="07B11A33">
+        <w:pict w14:anchorId="174F1013">
           <v:rect id="_x0000_i1063" alt="" style="width:425.2pt;height:.05pt;mso-width-percent:0;mso-height-percent:0;mso-width-percent:0;mso-height-percent:0" o:hralign="center" o:hrstd="t" o:hr="t" fillcolor="#a0a0a0" stroked="f"/>
         </w:pict>
       </w:r>
@@ -1816,7 +1816,7 @@
           <w:szCs w:val="22"/>
           <w:lang w:eastAsia="es-ES_tradnl"/>
         </w:rPr>
-        <w:pict w14:anchorId="4AA1057A">
+        <w:pict w14:anchorId="5CD55DC4">
           <v:rect id="_x0000_i1062" alt="" style="width:425.2pt;height:.05pt;mso-width-percent:0;mso-height-percent:0;mso-width-percent:0;mso-height-percent:0" o:hralign="center" o:hrstd="t" o:hr="t" fillcolor="#a0a0a0" stroked="f"/>
         </w:pict>
       </w:r>
@@ -2030,7 +2030,7 @@
           <w:szCs w:val="22"/>
           <w:lang w:eastAsia="es-ES_tradnl"/>
         </w:rPr>
-        <w:pict w14:anchorId="7B2C5701">
+        <w:pict w14:anchorId="3963F1B4">
           <v:rect id="_x0000_i1061" alt="" style="width:425.2pt;height:.05pt;mso-width-percent:0;mso-height-percent:0;mso-width-percent:0;mso-height-percent:0" o:hralign="center" o:hrstd="t" o:hr="t" fillcolor="#a0a0a0" stroked="f"/>
         </w:pict>
       </w:r>
@@ -2292,7 +2292,7 @@
           <w:szCs w:val="22"/>
           <w:lang w:eastAsia="es-ES_tradnl"/>
         </w:rPr>
-        <w:pict w14:anchorId="6D194021">
+        <w:pict w14:anchorId="70E1978B">
           <v:rect id="_x0000_i1060" alt="" style="width:425.2pt;height:.05pt;mso-width-percent:0;mso-height-percent:0;mso-width-percent:0;mso-height-percent:0" o:hralign="center" o:hrstd="t" o:hr="t" fillcolor="#a0a0a0" stroked="f"/>
         </w:pict>
       </w:r>
@@ -2479,7 +2479,7 @@
           <w:szCs w:val="22"/>
           <w:lang w:eastAsia="es-ES_tradnl"/>
         </w:rPr>
-        <w:pict w14:anchorId="67C12FAD">
+        <w:pict w14:anchorId="63A8A31D">
           <v:rect id="_x0000_i1059" alt="" style="width:425.2pt;height:.05pt;mso-width-percent:0;mso-height-percent:0;mso-width-percent:0;mso-height-percent:0" o:hralign="center" o:hrstd="t" o:hr="t" fillcolor="#a0a0a0" stroked="f"/>
         </w:pict>
       </w:r>
@@ -2872,7 +2872,7 @@
           <w:szCs w:val="22"/>
           <w:lang w:eastAsia="es-ES_tradnl"/>
         </w:rPr>
-        <w:pict w14:anchorId="583C39F9">
+        <w:pict w14:anchorId="4DEE7FD8">
           <v:rect id="_x0000_i1058" alt="" style="width:425.2pt;height:.05pt;mso-width-percent:0;mso-height-percent:0;mso-width-percent:0;mso-height-percent:0" o:hralign="center" o:hrstd="t" o:hr="t" fillcolor="#a0a0a0" stroked="f"/>
         </w:pict>
       </w:r>
@@ -3109,7 +3109,7 @@
           <w:szCs w:val="22"/>
           <w:lang w:eastAsia="es-ES_tradnl"/>
         </w:rPr>
-        <w:pict w14:anchorId="02FBA324">
+        <w:pict w14:anchorId="33B43686">
           <v:rect id="_x0000_i1057" alt="" style="width:425.2pt;height:.05pt;mso-width-percent:0;mso-height-percent:0;mso-width-percent:0;mso-height-percent:0" o:hralign="center" o:hrstd="t" o:hr="t" fillcolor="#a0a0a0" stroked="f"/>
         </w:pict>
       </w:r>
@@ -3322,7 +3322,7 @@
           <w:szCs w:val="22"/>
           <w:lang w:eastAsia="es-ES_tradnl"/>
         </w:rPr>
-        <w:pict w14:anchorId="1DE4F420">
+        <w:pict w14:anchorId="25BEE098">
           <v:rect id="_x0000_i1056" alt="" style="width:425.2pt;height:.05pt;mso-width-percent:0;mso-height-percent:0;mso-width-percent:0;mso-height-percent:0" o:hralign="center" o:hrstd="t" o:hr="t" fillcolor="#a0a0a0" stroked="f"/>
         </w:pict>
       </w:r>
@@ -3744,7 +3744,7 @@
           <w:lang w:eastAsia="es-ES_tradnl"/>
         </w:rPr>
         <w:lastRenderedPageBreak/>
-        <w:pict w14:anchorId="4D353CBD">
+        <w:pict w14:anchorId="5F5D3931">
           <v:rect id="_x0000_i1055" alt="" style="width:425.2pt;height:.05pt;mso-width-percent:0;mso-height-percent:0;mso-width-percent:0;mso-height-percent:0" o:hralign="center" o:hrstd="t" o:hr="t" fillcolor="#a0a0a0" stroked="f"/>
         </w:pict>
       </w:r>
@@ -4193,7 +4193,7 @@
           <w:szCs w:val="22"/>
           <w:lang w:eastAsia="es-ES_tradnl"/>
         </w:rPr>
-        <w:pict w14:anchorId="0FD2FB7D">
+        <w:pict w14:anchorId="756C1460">
           <v:rect id="_x0000_i1054" alt="" style="width:425.2pt;height:.05pt;mso-width-percent:0;mso-height-percent:0;mso-width-percent:0;mso-height-percent:0" o:hralign="center" o:hrstd="t" o:hr="t" fillcolor="#a0a0a0" stroked="f"/>
         </w:pict>
       </w:r>
@@ -4409,7 +4409,7 @@
           <w:szCs w:val="22"/>
           <w:lang w:eastAsia="es-ES_tradnl"/>
         </w:rPr>
-        <w:pict w14:anchorId="743246C7">
+        <w:pict w14:anchorId="7A9FB770">
           <v:rect id="_x0000_i1053" alt="" style="width:425.2pt;height:.05pt;mso-width-percent:0;mso-height-percent:0;mso-width-percent:0;mso-height-percent:0" o:hralign="center" o:hrstd="t" o:hr="t" fillcolor="#a0a0a0" stroked="f"/>
         </w:pict>
       </w:r>
@@ -4624,7 +4624,7 @@
           <w:szCs w:val="22"/>
           <w:lang w:eastAsia="es-ES_tradnl"/>
         </w:rPr>
-        <w:pict w14:anchorId="2D37A01B">
+        <w:pict w14:anchorId="2F2DB0C8">
           <v:rect id="_x0000_i1052" alt="" style="width:425.2pt;height:.05pt;mso-width-percent:0;mso-height-percent:0;mso-width-percent:0;mso-height-percent:0" o:hralign="center" o:hrstd="t" o:hr="t" fillcolor="#a0a0a0" stroked="f"/>
         </w:pict>
       </w:r>
@@ -4839,7 +4839,7 @@
           <w:szCs w:val="22"/>
           <w:lang w:eastAsia="es-ES_tradnl"/>
         </w:rPr>
-        <w:pict w14:anchorId="272D269E">
+        <w:pict w14:anchorId="530ABAF1">
           <v:rect id="_x0000_i1051" alt="" style="width:425.2pt;height:.05pt;mso-width-percent:0;mso-height-percent:0;mso-width-percent:0;mso-height-percent:0" o:hralign="center" o:hrstd="t" o:hr="t" fillcolor="#a0a0a0" stroked="f"/>
         </w:pict>
       </w:r>
@@ -4888,21 +4888,34 @@
           <w:rFonts w:eastAsia="Times New Roman" w:cs="Times New Roman"/>
           <w:b/>
           <w:bCs/>
-          <w:sz w:val="22"/>
-          <w:szCs w:val="22"/>
-          <w:lang w:eastAsia="es-ES_tradnl"/>
-        </w:rPr>
-      </w:pPr>
-      <w:r>
-        <w:rPr>
-          <w:rFonts w:eastAsia="Times New Roman" w:cs="Times New Roman"/>
-          <w:b/>
-          <w:bCs/>
-          <w:sz w:val="22"/>
-          <w:szCs w:val="22"/>
-          <w:lang w:eastAsia="es-ES_tradnl"/>
-        </w:rPr>
-        <w:t>Title: Camera permission handling on iOS</w:t>
+          <w:color w:val="EE0000"/>
+          <w:sz w:val="22"/>
+          <w:szCs w:val="22"/>
+          <w:lang w:eastAsia="es-ES_tradnl"/>
+        </w:rPr>
+      </w:pPr>
+      <w:r>
+        <w:rPr>
+          <w:rFonts w:eastAsia="Times New Roman" w:cs="Times New Roman"/>
+          <w:b/>
+          <w:bCs/>
+          <w:sz w:val="22"/>
+          <w:szCs w:val="22"/>
+          <w:lang w:eastAsia="es-ES_tradnl"/>
+        </w:rPr>
+        <w:t xml:space="preserve">Title: </w:t>
+      </w:r>
+      <w:r>
+        <w:rPr>
+          <w:rFonts w:eastAsia="Times New Roman" w:cs="Times New Roman"/>
+          <w:b/>
+          <w:bCs/>
+          <w:color w:val="EE0000"/>
+          <w:sz w:val="22"/>
+          <w:szCs w:val="22"/>
+          <w:lang w:eastAsia="es-ES_tradnl"/>
+        </w:rPr>
+        <w:t>Camera permission handling on iOS</w:t>
       </w:r>
     </w:p>
     <w:p>
@@ -5067,7 +5080,7 @@
           <w:szCs w:val="22"/>
           <w:lang w:eastAsia="es-ES_tradnl"/>
         </w:rPr>
-        <w:pict w14:anchorId="59BC08C9">
+        <w:pict w14:anchorId="294A37B8">
           <v:rect id="_x0000_i1050" alt="" style="width:425.2pt;height:.05pt;mso-width-percent:0;mso-height-percent:0;mso-width-percent:0;mso-height-percent:0" o:hralign="center" o:hrstd="t" o:hr="t" fillcolor="#a0a0a0" stroked="f"/>
         </w:pict>
       </w:r>
@@ -5258,7 +5271,7 @@
           <w:szCs w:val="22"/>
           <w:lang w:eastAsia="es-ES_tradnl"/>
         </w:rPr>
-        <w:pict w14:anchorId="5DC8ECDE">
+        <w:pict w14:anchorId="1B96D9C6">
           <v:rect id="_x0000_i1049" alt="" style="width:425.2pt;height:.05pt;mso-width-percent:0;mso-height-percent:0;mso-width-percent:0;mso-height-percent:0" o:hralign="center" o:hrstd="t" o:hr="t" fillcolor="#a0a0a0" stroked="f"/>
         </w:pict>
       </w:r>
@@ -5449,7 +5462,7 @@
           <w:szCs w:val="22"/>
           <w:lang w:eastAsia="es-ES_tradnl"/>
         </w:rPr>
-        <w:pict w14:anchorId="6A4EB47D">
+        <w:pict w14:anchorId="6DF1F48F">
           <v:rect id="_x0000_i1048" alt="" style="width:425.2pt;height:.05pt;mso-width-percent:0;mso-height-percent:0;mso-width-percent:0;mso-height-percent:0" o:hralign="center" o:hrstd="t" o:hr="t" fillcolor="#a0a0a0" stroked="f"/>
         </w:pict>
       </w:r>
@@ -5641,7 +5654,7 @@
           <w:szCs w:val="22"/>
           <w:lang w:eastAsia="es-ES_tradnl"/>
         </w:rPr>
-        <w:pict w14:anchorId="2A0D0C05">
+        <w:pict w14:anchorId="7EC47D2E">
           <v:rect id="_x0000_i1047" alt="" style="width:425.2pt;height:.05pt;mso-width-percent:0;mso-height-percent:0;mso-width-percent:0;mso-height-percent:0" o:hralign="center" o:hrstd="t" o:hr="t" fillcolor="#a0a0a0" stroked="f"/>
         </w:pict>
       </w:r>
@@ -5832,7 +5845,7 @@
           <w:szCs w:val="22"/>
           <w:lang w:eastAsia="es-ES_tradnl"/>
         </w:rPr>
-        <w:pict w14:anchorId="56988E6A">
+        <w:pict w14:anchorId="4E7C5AFE">
           <v:rect id="_x0000_i1046" alt="" style="width:425.2pt;height:.05pt;mso-width-percent:0;mso-height-percent:0;mso-width-percent:0;mso-height-percent:0" o:hralign="center" o:hrstd="t" o:hr="t" fillcolor="#a0a0a0" stroked="f"/>
         </w:pict>
       </w:r>
@@ -6059,7 +6072,7 @@
           <w:szCs w:val="22"/>
           <w:lang w:eastAsia="es-ES_tradnl"/>
         </w:rPr>
-        <w:pict w14:anchorId="3974E100">
+        <w:pict w14:anchorId="71AE702B">
           <v:rect id="_x0000_i1045" alt="" style="width:425.2pt;height:.05pt;mso-width-percent:0;mso-height-percent:0;mso-width-percent:0;mso-height-percent:0" o:hralign="center" o:hrstd="t" o:hr="t" fillcolor="#a0a0a0" stroked="f"/>
         </w:pict>
       </w:r>
@@ -6251,7 +6264,7 @@
           <w:szCs w:val="22"/>
           <w:lang w:eastAsia="es-ES_tradnl"/>
         </w:rPr>
-        <w:pict w14:anchorId="3A1C5B98">
+        <w:pict w14:anchorId="697128EA">
           <v:rect id="_x0000_i1044" alt="" style="width:425.2pt;height:.05pt;mso-width-percent:0;mso-height-percent:0;mso-width-percent:0;mso-height-percent:0" o:hralign="center" o:hrstd="t" o:hr="t" fillcolor="#a0a0a0" stroked="f"/>
         </w:pict>
       </w:r>
@@ -6478,7 +6491,7 @@
           <w:szCs w:val="22"/>
           <w:lang w:eastAsia="es-ES_tradnl"/>
         </w:rPr>
-        <w:pict w14:anchorId="5108A66B">
+        <w:pict w14:anchorId="1CC2659E">
           <v:rect id="_x0000_i1043" alt="" style="width:425.2pt;height:.05pt;mso-width-percent:0;mso-height-percent:0;mso-width-percent:0;mso-height-percent:0" o:hralign="center" o:hrstd="t" o:hr="t" fillcolor="#a0a0a0" stroked="f"/>
         </w:pict>
       </w:r>
@@ -6669,7 +6682,7 @@
           <w:szCs w:val="22"/>
           <w:lang w:eastAsia="es-ES_tradnl"/>
         </w:rPr>
-        <w:pict w14:anchorId="065C2C66">
+        <w:pict w14:anchorId="762A39F9">
           <v:rect id="_x0000_i1042" alt="" style="width:425.2pt;height:.05pt;mso-width-percent:0;mso-height-percent:0;mso-width-percent:0;mso-height-percent:0" o:hralign="center" o:hrstd="t" o:hr="t" fillcolor="#a0a0a0" stroked="f"/>
         </w:pict>
       </w:r>
@@ -6861,7 +6874,7 @@
           <w:szCs w:val="22"/>
           <w:lang w:eastAsia="es-ES_tradnl"/>
         </w:rPr>
-        <w:pict w14:anchorId="553DE728">
+        <w:pict w14:anchorId="01F0C0A7">
           <v:rect id="_x0000_i1041" alt="" style="width:425.2pt;height:.05pt;mso-width-percent:0;mso-height-percent:0;mso-width-percent:0;mso-height-percent:0" o:hralign="center" o:hrstd="t" o:hr="t" fillcolor="#a0a0a0" stroked="f"/>
         </w:pict>
       </w:r>
@@ -7052,7 +7065,7 @@
           <w:szCs w:val="22"/>
           <w:lang w:eastAsia="es-ES_tradnl"/>
         </w:rPr>
-        <w:pict w14:anchorId="12298BD4">
+        <w:pict w14:anchorId="63366301">
           <v:rect id="_x0000_i1040" alt="" style="width:425.2pt;height:.05pt;mso-width-percent:0;mso-height-percent:0;mso-width-percent:0;mso-height-percent:0" o:hralign="center" o:hrstd="t" o:hr="t" fillcolor="#a0a0a0" stroked="f"/>
         </w:pict>
       </w:r>
@@ -7243,7 +7256,7 @@
           <w:szCs w:val="22"/>
           <w:lang w:eastAsia="es-ES_tradnl"/>
         </w:rPr>
-        <w:pict w14:anchorId="21F7D437">
+        <w:pict w14:anchorId="4FD3E6B8">
           <v:rect id="_x0000_i1039" alt="" style="width:425.2pt;height:.05pt;mso-width-percent:0;mso-height-percent:0;mso-width-percent:0;mso-height-percent:0" o:hralign="center" o:hrstd="t" o:hr="t" fillcolor="#a0a0a0" stroked="f"/>
         </w:pict>
       </w:r>
@@ -7434,7 +7447,7 @@
           <w:szCs w:val="22"/>
           <w:lang w:eastAsia="es-ES_tradnl"/>
         </w:rPr>
-        <w:pict w14:anchorId="7B917BD1">
+        <w:pict w14:anchorId="602A9CD2">
           <v:rect id="_x0000_i1038" alt="" style="width:425.2pt;height:.05pt;mso-width-percent:0;mso-height-percent:0;mso-width-percent:0;mso-height-percent:0" o:hralign="center" o:hrstd="t" o:hr="t" fillcolor="#a0a0a0" stroked="f"/>
         </w:pict>
       </w:r>
@@ -7626,7 +7639,7 @@
           <w:szCs w:val="22"/>
           <w:lang w:eastAsia="es-ES_tradnl"/>
         </w:rPr>
-        <w:pict w14:anchorId="672E8045">
+        <w:pict w14:anchorId="1E10B3F6">
           <v:rect id="_x0000_i1037" alt="" style="width:425.2pt;height:.05pt;mso-width-percent:0;mso-height-percent:0;mso-width-percent:0;mso-height-percent:0" o:hralign="center" o:hrstd="t" o:hr="t" fillcolor="#a0a0a0" stroked="f"/>
         </w:pict>
       </w:r>
@@ -7853,7 +7866,7 @@
           <w:szCs w:val="22"/>
           <w:lang w:eastAsia="es-ES_tradnl"/>
         </w:rPr>
-        <w:pict w14:anchorId="38CD50F0">
+        <w:pict w14:anchorId="119DB331">
           <v:rect id="_x0000_i1036" alt="" style="width:425.2pt;height:.05pt;mso-width-percent:0;mso-height-percent:0;mso-width-percent:0;mso-height-percent:0" o:hralign="center" o:hrstd="t" o:hr="t" fillcolor="#a0a0a0" stroked="f"/>
         </w:pict>
       </w:r>
@@ -8044,7 +8057,7 @@
           <w:szCs w:val="22"/>
           <w:lang w:eastAsia="es-ES_tradnl"/>
         </w:rPr>
-        <w:pict w14:anchorId="3232B7B4">
+        <w:pict w14:anchorId="2A20B344">
           <v:rect id="_x0000_i1035" alt="" style="width:425.2pt;height:.05pt;mso-width-percent:0;mso-height-percent:0;mso-width-percent:0;mso-height-percent:0" o:hralign="center" o:hrstd="t" o:hr="t" fillcolor="#a0a0a0" stroked="f"/>
         </w:pict>
       </w:r>
@@ -8272,7 +8285,7 @@
           <w:szCs w:val="22"/>
           <w:lang w:eastAsia="es-ES_tradnl"/>
         </w:rPr>
-        <w:pict w14:anchorId="562D8FCD">
+        <w:pict w14:anchorId="73B1891D">
           <v:rect id="_x0000_i1034" alt="" style="width:425.2pt;height:.05pt;mso-width-percent:0;mso-height-percent:0;mso-width-percent:0;mso-height-percent:0" o:hralign="center" o:hrstd="t" o:hr="t" fillcolor="#a0a0a0" stroked="f"/>
         </w:pict>
       </w:r>
@@ -8463,7 +8476,7 @@
           <w:szCs w:val="22"/>
           <w:lang w:eastAsia="es-ES_tradnl"/>
         </w:rPr>
-        <w:pict w14:anchorId="4DE896F7">
+        <w:pict w14:anchorId="4C85E3AE">
           <v:rect id="_x0000_i1033" alt="" style="width:425.2pt;height:.05pt;mso-width-percent:0;mso-height-percent:0;mso-width-percent:0;mso-height-percent:0" o:hralign="center" o:hrstd="t" o:hr="t" fillcolor="#a0a0a0" stroked="f"/>
         </w:pict>
       </w:r>
@@ -8654,7 +8667,7 @@
           <w:szCs w:val="22"/>
           <w:lang w:eastAsia="es-ES_tradnl"/>
         </w:rPr>
-        <w:pict w14:anchorId="0BB0758C">
+        <w:pict w14:anchorId="12728609">
           <v:rect id="_x0000_i1032" alt="" style="width:425.2pt;height:.05pt;mso-width-percent:0;mso-height-percent:0;mso-width-percent:0;mso-height-percent:0" o:hralign="center" o:hrstd="t" o:hr="t" fillcolor="#a0a0a0" stroked="f"/>
         </w:pict>
       </w:r>
@@ -8882,7 +8895,7 @@
           <w:szCs w:val="22"/>
           <w:lang w:eastAsia="es-ES_tradnl"/>
         </w:rPr>
-        <w:pict w14:anchorId="5D26DDCF">
+        <w:pict w14:anchorId="66520757">
           <v:rect id="_x0000_i1031" alt="" style="width:425.2pt;height:.05pt;mso-width-percent:0;mso-height-percent:0;mso-width-percent:0;mso-height-percent:0" o:hralign="center" o:hrstd="t" o:hr="t" fillcolor="#a0a0a0" stroked="f"/>
         </w:pict>
       </w:r>
@@ -9073,7 +9086,7 @@
           <w:szCs w:val="22"/>
           <w:lang w:eastAsia="es-ES_tradnl"/>
         </w:rPr>
-        <w:pict w14:anchorId="35AFB4D0">
+        <w:pict w14:anchorId="24E47728">
           <v:rect id="_x0000_i1030" alt="" style="width:425.2pt;height:.05pt;mso-width-percent:0;mso-height-percent:0;mso-width-percent:0;mso-height-percent:0" o:hralign="center" o:hrstd="t" o:hr="t" fillcolor="#a0a0a0" stroked="f"/>
         </w:pict>
       </w:r>
@@ -9301,7 +9314,7 @@
           <w:szCs w:val="22"/>
           <w:lang w:eastAsia="es-ES_tradnl"/>
         </w:rPr>
-        <w:pict w14:anchorId="56AAAEBA">
+        <w:pict w14:anchorId="599A3C4D">
           <v:rect id="_x0000_i1029" alt="" style="width:425.2pt;height:.05pt;mso-width-percent:0;mso-height-percent:0;mso-width-percent:0;mso-height-percent:0" o:hralign="center" o:hrstd="t" o:hr="t" fillcolor="#a0a0a0" stroked="f"/>
         </w:pict>
       </w:r>
@@ -9539,7 +9552,7 @@
           <w:szCs w:val="22"/>
           <w:lang w:eastAsia="es-ES_tradnl"/>
         </w:rPr>
-        <w:pict w14:anchorId="68E20695">
+        <w:pict w14:anchorId="61B6CCEF">
           <v:rect id="_x0000_i1028" alt="" style="width:425.2pt;height:.05pt;mso-width-percent:0;mso-height-percent:0;mso-width-percent:0;mso-height-percent:0" o:hralign="center" o:hrstd="t" o:hr="t" fillcolor="#a0a0a0" stroked="f"/>
         </w:pict>
       </w:r>
@@ -9730,7 +9743,7 @@
           <w:szCs w:val="22"/>
           <w:lang w:eastAsia="es-ES_tradnl"/>
         </w:rPr>
-        <w:pict w14:anchorId="2A01B3DE">
+        <w:pict w14:anchorId="3F2B6C47">
           <v:rect id="_x0000_i1027" alt="" style="width:425.2pt;height:.05pt;mso-width-percent:0;mso-height-percent:0;mso-width-percent:0;mso-height-percent:0" o:hralign="center" o:hrstd="t" o:hr="t" fillcolor="#a0a0a0" stroked="f"/>
         </w:pict>
       </w:r>
@@ -9922,7 +9935,7 @@
           <w:szCs w:val="22"/>
           <w:lang w:eastAsia="es-ES_tradnl"/>
         </w:rPr>
-        <w:pict w14:anchorId="56A137B2">
+        <w:pict w14:anchorId="525C4361">
           <v:rect id="_x0000_i1026" alt="" style="width:425.2pt;height:.05pt;mso-width-percent:0;mso-height-percent:0;mso-width-percent:0;mso-height-percent:0" o:hralign="center" o:hrstd="t" o:hr="t" fillcolor="#a0a0a0" stroked="f"/>
         </w:pict>
       </w:r>
@@ -10149,7 +10162,7 @@
           <w:szCs w:val="22"/>
           <w:lang w:eastAsia="es-ES_tradnl"/>
         </w:rPr>
-        <w:pict w14:anchorId="78813387">
+        <w:pict w14:anchorId="6C3BA428">
           <v:rect id="_x0000_i1025" alt="" style="width:425.2pt;height:.05pt;mso-width-percent:0;mso-height-percent:0;mso-width-percent:0;mso-height-percent:0" o:hralign="center" o:hrstd="t" o:hr="t" fillcolor="#a0a0a0" stroked="f"/>
         </w:pict>
       </w:r>

</xml_diff>